<commit_message>
저자 affiliation 분리 (a/b 윗첨자) + MDPI Applied Sciences 양식 적용
[저자 / 소속]
- ¹ Yongcheul Jun  →  College of Engineering (Major in Intellectual
  Property Convergence), Pusan National University, Busan, 46241
- ²,* Kwangwook Park  →  Division of Electronics and Information
  Engineering, Jeonbuk National University, Jeonju 54896
- 윗첨자는 docx run.font.superscript 로 inline 적용 (PDF 변환 시 보존).

[MDPI Applied Sciences 양식]
- 폰트: Palatino Linotype (없으면 Times New Roman 폴백)
- 페이지 여백: A4, 1.78 cm 사방
- 상단 "Article" italic 라벨
- Title: 16pt bold, 좌측 정렬 (MDPI 표준)
- "Abstract:" / "Keywords:" 굵은 라벨 + inline 본문 단락 (separate 섹션이 아닌 단락)
- 저자 affiliation 들여쓰기 (hanging indent 0.5 cm)
- "* Correspondence: ..." 한 줄

[주의사항]
- MDPI 공식 양식은 https://www.mdpi.com/journal/applsci/instructions
  의 .docx 템플릿이 정석. 본 파일은 핵심 양식만 모방. 투고 전 공식
  템플릿에 본문 + 그림을 옮겨 넣는 것을 권장.
</commit_message>
<xml_diff>
--- a/paper/Jun_HfS2_image_oxidation.docx
+++ b/paper/Jun_HfS2_image_oxidation.docx
@@ -4,77 +4,182 @@
   <w:body>
     <w:p>
       <w:pPr>
-        <w:spacing w:after="120"/>
-        <w:jc w:val="center"/>
+        <w:spacing w:after="80"/>
+        <w:jc w:val="left"/>
       </w:pPr>
       <w:r>
         <w:rPr>
-          <w:rFonts w:ascii="Times New Roman" w:hAnsi="Times New Roman"/>
-          <w:b/>
-          <w:sz w:val="28"/>
+          <w:rFonts w:ascii="Palatino Linotype" w:hAnsi="Palatino Linotype"/>
+          <w:i/>
+          <w:sz w:val="20"/>
         </w:rPr>
-        <w:t>Image-based estimation of native oxidation aging in CVD-grown HfS₂ thin films via multi-method ensemble and pseudo-Raman reconstruction</w:t>
+        <w:t>Article</w:t>
       </w:r>
     </w:p>
     <w:p>
       <w:pPr>
-        <w:jc w:val="center"/>
+        <w:spacing w:after="120"/>
+        <w:jc w:val="left"/>
       </w:pPr>
       <w:r>
         <w:rPr>
-          <w:rFonts w:ascii="Times New Roman" w:hAnsi="Times New Roman"/>
+          <w:rFonts w:ascii="Palatino Linotype" w:hAnsi="Palatino Linotype"/>
           <w:b/>
+          <w:sz w:val="32"/>
+        </w:rPr>
+        <w:t>Image-based Estimation of Native Oxidation Aging in CVD-grown HfS₂ Thin Films via Multi-method Ensemble and Pseudo-Raman Reconstruction</w:t>
+      </w:r>
+    </w:p>
+    <w:p>
+      <w:pPr>
+        <w:spacing w:after="40"/>
+        <w:jc w:val="left"/>
+      </w:pPr>
+      <w:r>
+        <w:rPr>
+          <w:rFonts w:ascii="Palatino Linotype" w:hAnsi="Palatino Linotype"/>
+          <w:b w:val="0"/>
           <w:sz w:val="22"/>
         </w:rPr>
         <w:t>Yongcheul Jun</w:t>
       </w:r>
       <w:r>
         <w:rPr>
-          <w:b w:val="0"/>
-          <w:sz w:val="18"/>
+          <w:rFonts w:ascii="Palatino Linotype" w:hAnsi="Palatino Linotype"/>
+          <w:sz w:val="22"/>
+          <w:vertAlign w:val="superscript"/>
         </w:rPr>
-        <w:t xml:space="preserve">ᵃ, </w:t>
+        <w:t xml:space="preserve"> 1</w:t>
       </w:r>
       <w:r>
         <w:rPr>
-          <w:rFonts w:ascii="Times New Roman" w:hAnsi="Times New Roman"/>
-          <w:b/>
+          <w:rFonts w:ascii="Palatino Linotype" w:hAnsi="Palatino Linotype"/>
+          <w:sz w:val="22"/>
+        </w:rPr>
+        <w:t xml:space="preserve">, </w:t>
+      </w:r>
+      <w:r>
+        <w:rPr>
+          <w:rFonts w:ascii="Palatino Linotype" w:hAnsi="Palatino Linotype"/>
+          <w:b w:val="0"/>
           <w:sz w:val="22"/>
         </w:rPr>
         <w:t>Kwangwook Park</w:t>
       </w:r>
       <w:r>
         <w:rPr>
-          <w:b w:val="0"/>
-          <w:sz w:val="18"/>
+          <w:rFonts w:ascii="Palatino Linotype" w:hAnsi="Palatino Linotype"/>
+          <w:sz w:val="22"/>
+          <w:vertAlign w:val="superscript"/>
         </w:rPr>
-        <w:t>ᵃ,*</w:t>
+        <w:t xml:space="preserve"> 2,*</w:t>
       </w:r>
     </w:p>
     <w:p>
       <w:pPr>
-        <w:jc w:val="center"/>
+        <w:spacing w:after="40"/>
+        <w:ind w:left="283" w:hanging="283"/>
       </w:pPr>
       <w:r>
         <w:rPr>
-          <w:rFonts w:ascii="Times New Roman" w:hAnsi="Times New Roman"/>
+          <w:rFonts w:ascii="Palatino Linotype" w:hAnsi="Palatino Linotype"/>
+          <w:sz w:val="18"/>
+          <w:vertAlign w:val="superscript"/>
+        </w:rPr>
+        <w:t>1</w:t>
+      </w:r>
+      <w:r>
+        <w:rPr>
+          <w:rFonts w:ascii="Palatino Linotype" w:hAnsi="Palatino Linotype"/>
           <w:i/>
           <w:sz w:val="18"/>
         </w:rPr>
-        <w:t>ᵃDivision of Electronics and Information Engineering, Jeonbuk National University, Jeonju 54896, Republic of Korea</w:t>
+        <w:t xml:space="preserve"> College of Engineering (Major in Intellectual Property Convergence), Pusan National University, Busan, 46241, Republic of Korea</w:t>
+      </w:r>
+    </w:p>
+    <w:p>
+      <w:pPr>
+        <w:spacing w:after="40"/>
+        <w:ind w:left="283" w:hanging="283"/>
+      </w:pPr>
+      <w:r>
+        <w:rPr>
+          <w:rFonts w:ascii="Palatino Linotype" w:hAnsi="Palatino Linotype"/>
+          <w:sz w:val="18"/>
+          <w:vertAlign w:val="superscript"/>
+        </w:rPr>
+        <w:t>2</w:t>
+      </w:r>
+      <w:r>
+        <w:rPr>
+          <w:rFonts w:ascii="Palatino Linotype" w:hAnsi="Palatino Linotype"/>
+          <w:i/>
+          <w:sz w:val="18"/>
+        </w:rPr>
+        <w:t xml:space="preserve"> Division of Electronics and Information Engineering, Jeonbuk National University, Jeonju 54896, Republic of Korea</w:t>
       </w:r>
     </w:p>
     <w:p>
       <w:pPr>
         <w:spacing w:after="200"/>
-        <w:jc w:val="center"/>
+        <w:ind w:left="283" w:hanging="283"/>
       </w:pPr>
       <w:r>
         <w:rPr>
-          <w:rFonts w:ascii="Times New Roman" w:hAnsi="Times New Roman"/>
+          <w:rFonts w:ascii="Palatino Linotype" w:hAnsi="Palatino Linotype"/>
+          <w:sz w:val="18"/>
+          <w:vertAlign w:val="superscript"/>
+        </w:rPr>
+        <w:t>*</w:t>
+      </w:r>
+      <w:r>
+        <w:rPr>
+          <w:rFonts w:ascii="Palatino Linotype" w:hAnsi="Palatino Linotype"/>
           <w:sz w:val="18"/>
         </w:rPr>
-        <w:t>*Corresponding author. E-mail: kpark@jbnu.ac.kr (K. Park)</w:t>
+        <w:t xml:space="preserve"> Correspondence: kpark@jbnu.ac.kr (K. P.)</w:t>
+      </w:r>
+    </w:p>
+    <w:p>
+      <w:pPr>
+        <w:spacing w:after="80"/>
+        <w:jc w:val="both"/>
+      </w:pPr>
+      <w:r>
+        <w:rPr>
+          <w:rFonts w:ascii="Palatino Linotype" w:hAnsi="Palatino Linotype"/>
+          <w:b/>
+          <w:sz w:val="20"/>
+        </w:rPr>
+        <w:t xml:space="preserve">Abstract: </w:t>
+      </w:r>
+      <w:r>
+        <w:rPr>
+          <w:rFonts w:ascii="Palatino Linotype" w:hAnsi="Palatino Linotype"/>
+          <w:sz w:val="20"/>
+        </w:rPr>
+        <w:t>Hafnium disulfide (HfS₂), a layered transition-metal dichalcogenide considered for high-mobility electronics and photodetectors, undergoes rapid native oxidation under ambient humidity, transforming the originally yellow chalcogenide into a transparent oxide (HfOₓ) within days. Quantifying the extent of oxidation conventionally requires Raman spectroscopy, which is instrument-bound and slow. In this work we propose an image-only framework that estimates the aging day of CVD-grown HfS₂ thin films directly from a single specimen photograph and, in addition, reconstructs a pseudo-Raman spectrum without any spectroscopic measurement. A pool of 53 specimen images covering four passivation conditions (Native HfS₂ at 35% and 70% RH, Al₂O₃- and PMMA-encapsulated HfS₂ at 70% RH) and aging days from 0 to 30 d is analyzed by five independent estimators—weighted-Euclidean k-nearest-neighbour on color metrics, Wasserstein distance on b∗ histograms, FFT texture distance, spatial-pattern distance, and an exponential-decay kinetic fit—whose outputs are combined by a Huber-loss optimised, condition-specific ensemble. Leave-one-out evaluation on 33 query specimens yields a weighted-mean root-mean-square error of 4.80 d, a 38% reduction relative to the uniform-weight baseline (7.74 d). For Al₂O₃-encapsulated HfS₂ the image-derived A₁ₒ peak intensity reproduces the measured Raman trend (1.00 → 0.60) within the predicted 95% confidence interval, demonstrating that image-only pseudo-Raman reconstruction can serve as a rapid, non-destructive surrogate for benchtop Raman spectroscopy in routine quality screening of HfS₂ thin films.</w:t>
+      </w:r>
+    </w:p>
+    <w:p>
+      <w:pPr>
+        <w:spacing w:after="200"/>
+        <w:jc w:val="both"/>
+      </w:pPr>
+      <w:r>
+        <w:rPr>
+          <w:rFonts w:ascii="Palatino Linotype" w:hAnsi="Palatino Linotype"/>
+          <w:b/>
+          <w:sz w:val="20"/>
+        </w:rPr>
+        <w:t xml:space="preserve">Keywords: </w:t>
+      </w:r>
+      <w:r>
+        <w:rPr>
+          <w:rFonts w:ascii="Palatino Linotype" w:hAnsi="Palatino Linotype"/>
+          <w:sz w:val="20"/>
+        </w:rPr>
+        <w:t>hafnium disulfide; native oxidation; image processing; pseudo-Raman; ensemble regression; CVD thin films</w:t>
       </w:r>
     </w:p>
     <w:p>
@@ -83,47 +188,7 @@
       </w:pPr>
       <w:r>
         <w:rPr>
-          <w:rFonts w:ascii="Times New Roman" w:hAnsi="Times New Roman"/>
-          <w:b/>
-          <w:sz w:val="22"/>
-        </w:rPr>
-        <w:t>Abstract</w:t>
-      </w:r>
-    </w:p>
-    <w:p>
-      <w:pPr>
-        <w:spacing w:after="120"/>
-        <w:jc w:val="both"/>
-      </w:pPr>
-      <w:r>
-        <w:rPr>
-          <w:rFonts w:ascii="Times New Roman" w:hAnsi="Times New Roman"/>
-          <w:i w:val="0"/>
-          <w:sz w:val="20"/>
-        </w:rPr>
-        <w:t>Hafnium disulfide (HfS₂), a layered transition-metal dichalcogenide considered for high-mobility electronics and photodetectors, undergoes rapid native oxidation under ambient humidity, transforming the originally yellow chalcogenide into a transparent oxide (HfOₓ) within days. Quantifying the extent of oxidation conventionally requires Raman spectroscopy, which is instrument-bound and slow. In this work we propose an image-only framework that estimates the aging day of CVD-grown HfS₂ thin films directly from a single specimen photograph and, in addition, reconstructs a pseudo-Raman spectrum without any spectroscopic measurement. A pool of 53 specimen images covering four passivation conditions (Native HfS₂ at 35% and 70% RH, Al₂O₃- and PMMA-encapsulated HfS₂ at 70% RH) and aging days from 0 to 30 d is analyzed by five independent estimators — weighted-Euclidean k-nearest-neighbour on color metrics, Wasserstein distance on b∗ histograms, FFT texture distance, spatial-pattern distance, and an exponential-decay kinetic fit — whose outputs are combined by a Huber-loss optimised, condition-specific ensemble. Leave-one-out evaluation on 33 query specimens yields a weighted-mean root-mean-square error of 4.80 d, a 38% reduction relative to the uniform-weight baseline (7.74 d). For Al₂O₃-encapsulated HfS₂ the image-derived A₁ₒ peak intensity reproduces the measured Raman trend (1.00 → 0.60) within the predicted 95% confidence interval, demonstrating that image-only pseudo-Raman reconstruction can serve as a rapid, non-destructive surrogate for benchtop Raman spectroscopy in routine quality screening of HfS₂ thin films.</w:t>
-      </w:r>
-    </w:p>
-    <w:p>
-      <w:pPr>
-        <w:spacing w:after="200"/>
-      </w:pPr>
-      <w:r>
-        <w:rPr>
-          <w:rFonts w:ascii="Times New Roman" w:hAnsi="Times New Roman"/>
-          <w:i w:val="0"/>
-          <w:sz w:val="18"/>
-        </w:rPr>
-        <w:t>Keywords: Hafnium disulfide; Native oxidation; Image processing; Pseudo-Raman; Ensemble regression; CVD thin films</w:t>
-      </w:r>
-    </w:p>
-    <w:p>
-      <w:pPr>
-        <w:spacing w:before="160" w:after="80"/>
-      </w:pPr>
-      <w:r>
-        <w:rPr>
-          <w:rFonts w:ascii="Times New Roman" w:hAnsi="Times New Roman"/>
+          <w:rFonts w:ascii="Palatino Linotype" w:hAnsi="Palatino Linotype"/>
           <w:b/>
           <w:sz w:val="24"/>
         </w:rPr>
@@ -137,7 +202,7 @@
       </w:pPr>
       <w:r>
         <w:rPr>
-          <w:rFonts w:ascii="Times New Roman" w:hAnsi="Times New Roman"/>
+          <w:rFonts w:ascii="Palatino Linotype" w:hAnsi="Palatino Linotype"/>
           <w:i w:val="0"/>
           <w:sz w:val="20"/>
         </w:rPr>
@@ -151,7 +216,7 @@
       </w:pPr>
       <w:r>
         <w:rPr>
-          <w:rFonts w:ascii="Times New Roman" w:hAnsi="Times New Roman"/>
+          <w:rFonts w:ascii="Palatino Linotype" w:hAnsi="Palatino Linotype"/>
           <w:i w:val="0"/>
           <w:sz w:val="20"/>
         </w:rPr>
@@ -165,7 +230,7 @@
       </w:pPr>
       <w:r>
         <w:rPr>
-          <w:rFonts w:ascii="Times New Roman" w:hAnsi="Times New Roman"/>
+          <w:rFonts w:ascii="Palatino Linotype" w:hAnsi="Palatino Linotype"/>
           <w:i w:val="0"/>
           <w:sz w:val="20"/>
         </w:rPr>
@@ -178,7 +243,7 @@
       </w:pPr>
       <w:r>
         <w:rPr>
-          <w:rFonts w:ascii="Times New Roman" w:hAnsi="Times New Roman"/>
+          <w:rFonts w:ascii="Palatino Linotype" w:hAnsi="Palatino Linotype"/>
           <w:b/>
           <w:sz w:val="24"/>
         </w:rPr>
@@ -191,7 +256,7 @@
       </w:pPr>
       <w:r>
         <w:rPr>
-          <w:rFonts w:ascii="Times New Roman" w:hAnsi="Times New Roman"/>
+          <w:rFonts w:ascii="Palatino Linotype" w:hAnsi="Palatino Linotype"/>
           <w:b/>
           <w:sz w:val="22"/>
         </w:rPr>
@@ -205,7 +270,7 @@
       </w:pPr>
       <w:r>
         <w:rPr>
-          <w:rFonts w:ascii="Times New Roman" w:hAnsi="Times New Roman"/>
+          <w:rFonts w:ascii="Palatino Linotype" w:hAnsi="Palatino Linotype"/>
           <w:i w:val="0"/>
           <w:sz w:val="20"/>
         </w:rPr>
@@ -258,7 +323,7 @@
       </w:pPr>
       <w:r>
         <w:rPr>
-          <w:rFonts w:ascii="Times New Roman" w:hAnsi="Times New Roman"/>
+          <w:rFonts w:ascii="Palatino Linotype" w:hAnsi="Palatino Linotype"/>
           <w:i/>
           <w:sz w:val="18"/>
         </w:rPr>
@@ -271,7 +336,7 @@
       </w:pPr>
       <w:r>
         <w:rPr>
-          <w:rFonts w:ascii="Times New Roman" w:hAnsi="Times New Roman"/>
+          <w:rFonts w:ascii="Palatino Linotype" w:hAnsi="Palatino Linotype"/>
           <w:b/>
           <w:sz w:val="22"/>
         </w:rPr>
@@ -285,7 +350,7 @@
       </w:pPr>
       <w:r>
         <w:rPr>
-          <w:rFonts w:ascii="Times New Roman" w:hAnsi="Times New Roman"/>
+          <w:rFonts w:ascii="Palatino Linotype" w:hAnsi="Palatino Linotype"/>
           <w:i w:val="0"/>
           <w:sz w:val="20"/>
         </w:rPr>
@@ -299,7 +364,7 @@
       </w:pPr>
       <w:r>
         <w:rPr>
-          <w:rFonts w:ascii="Times New Roman" w:hAnsi="Times New Roman"/>
+          <w:rFonts w:ascii="Palatino Linotype" w:hAnsi="Palatino Linotype"/>
           <w:i w:val="0"/>
           <w:sz w:val="20"/>
         </w:rPr>
@@ -312,7 +377,7 @@
       </w:pPr>
       <w:r>
         <w:rPr>
-          <w:rFonts w:ascii="Times New Roman" w:hAnsi="Times New Roman"/>
+          <w:rFonts w:ascii="Palatino Linotype" w:hAnsi="Palatino Linotype"/>
           <w:b/>
           <w:sz w:val="22"/>
         </w:rPr>
@@ -326,7 +391,7 @@
       </w:pPr>
       <w:r>
         <w:rPr>
-          <w:rFonts w:ascii="Times New Roman" w:hAnsi="Times New Roman"/>
+          <w:rFonts w:ascii="Palatino Linotype" w:hAnsi="Palatino Linotype"/>
           <w:i w:val="0"/>
           <w:sz w:val="20"/>
         </w:rPr>
@@ -379,7 +444,7 @@
       </w:pPr>
       <w:r>
         <w:rPr>
-          <w:rFonts w:ascii="Times New Roman" w:hAnsi="Times New Roman"/>
+          <w:rFonts w:ascii="Palatino Linotype" w:hAnsi="Palatino Linotype"/>
           <w:i/>
           <w:sz w:val="18"/>
         </w:rPr>
@@ -393,7 +458,7 @@
       </w:pPr>
       <w:r>
         <w:rPr>
-          <w:rFonts w:ascii="Times New Roman" w:hAnsi="Times New Roman"/>
+          <w:rFonts w:ascii="Palatino Linotype" w:hAnsi="Palatino Linotype"/>
           <w:i w:val="0"/>
           <w:sz w:val="20"/>
         </w:rPr>
@@ -406,7 +471,7 @@
       </w:pPr>
       <w:r>
         <w:rPr>
-          <w:rFonts w:ascii="Times New Roman" w:hAnsi="Times New Roman"/>
+          <w:rFonts w:ascii="Palatino Linotype" w:hAnsi="Palatino Linotype"/>
           <w:b/>
           <w:sz w:val="22"/>
         </w:rPr>
@@ -420,7 +485,7 @@
       </w:pPr>
       <w:r>
         <w:rPr>
-          <w:rFonts w:ascii="Times New Roman" w:hAnsi="Times New Roman"/>
+          <w:rFonts w:ascii="Palatino Linotype" w:hAnsi="Palatino Linotype"/>
           <w:i w:val="0"/>
           <w:sz w:val="20"/>
         </w:rPr>
@@ -433,7 +498,7 @@
       </w:pPr>
       <w:r>
         <w:rPr>
-          <w:rFonts w:ascii="Times New Roman" w:hAnsi="Times New Roman"/>
+          <w:rFonts w:ascii="Palatino Linotype" w:hAnsi="Palatino Linotype"/>
           <w:b/>
           <w:sz w:val="24"/>
         </w:rPr>
@@ -446,7 +511,7 @@
       </w:pPr>
       <w:r>
         <w:rPr>
-          <w:rFonts w:ascii="Times New Roman" w:hAnsi="Times New Roman"/>
+          <w:rFonts w:ascii="Palatino Linotype" w:hAnsi="Palatino Linotype"/>
           <w:b/>
           <w:sz w:val="22"/>
         </w:rPr>
@@ -460,7 +525,7 @@
       </w:pPr>
       <w:r>
         <w:rPr>
-          <w:rFonts w:ascii="Times New Roman" w:hAnsi="Times New Roman"/>
+          <w:rFonts w:ascii="Palatino Linotype" w:hAnsi="Palatino Linotype"/>
           <w:i w:val="0"/>
           <w:sz w:val="20"/>
         </w:rPr>
@@ -513,7 +578,7 @@
       </w:pPr>
       <w:r>
         <w:rPr>
-          <w:rFonts w:ascii="Times New Roman" w:hAnsi="Times New Roman"/>
+          <w:rFonts w:ascii="Palatino Linotype" w:hAnsi="Palatino Linotype"/>
           <w:i/>
           <w:sz w:val="18"/>
         </w:rPr>
@@ -527,7 +592,7 @@
       </w:pPr>
       <w:r>
         <w:rPr>
-          <w:rFonts w:ascii="Times New Roman" w:hAnsi="Times New Roman"/>
+          <w:rFonts w:ascii="Palatino Linotype" w:hAnsi="Palatino Linotype"/>
           <w:i w:val="0"/>
           <w:sz w:val="20"/>
         </w:rPr>
@@ -540,7 +605,7 @@
       </w:pPr>
       <w:r>
         <w:rPr>
-          <w:rFonts w:ascii="Times New Roman" w:hAnsi="Times New Roman"/>
+          <w:rFonts w:ascii="Palatino Linotype" w:hAnsi="Palatino Linotype"/>
           <w:b/>
           <w:sz w:val="22"/>
         </w:rPr>
@@ -554,7 +619,7 @@
       </w:pPr>
       <w:r>
         <w:rPr>
-          <w:rFonts w:ascii="Times New Roman" w:hAnsi="Times New Roman"/>
+          <w:rFonts w:ascii="Palatino Linotype" w:hAnsi="Palatino Linotype"/>
           <w:i w:val="0"/>
           <w:sz w:val="20"/>
         </w:rPr>
@@ -607,7 +672,7 @@
       </w:pPr>
       <w:r>
         <w:rPr>
-          <w:rFonts w:ascii="Times New Roman" w:hAnsi="Times New Roman"/>
+          <w:rFonts w:ascii="Palatino Linotype" w:hAnsi="Palatino Linotype"/>
           <w:i/>
           <w:sz w:val="18"/>
         </w:rPr>
@@ -621,7 +686,7 @@
       </w:pPr>
       <w:r>
         <w:rPr>
-          <w:rFonts w:ascii="Times New Roman" w:hAnsi="Times New Roman"/>
+          <w:rFonts w:ascii="Palatino Linotype" w:hAnsi="Palatino Linotype"/>
           <w:i w:val="0"/>
           <w:sz w:val="20"/>
         </w:rPr>
@@ -634,7 +699,7 @@
       </w:pPr>
       <w:r>
         <w:rPr>
-          <w:rFonts w:ascii="Times New Roman" w:hAnsi="Times New Roman"/>
+          <w:rFonts w:ascii="Palatino Linotype" w:hAnsi="Palatino Linotype"/>
           <w:b/>
           <w:sz w:val="22"/>
         </w:rPr>
@@ -648,7 +713,7 @@
       </w:pPr>
       <w:r>
         <w:rPr>
-          <w:rFonts w:ascii="Times New Roman" w:hAnsi="Times New Roman"/>
+          <w:rFonts w:ascii="Palatino Linotype" w:hAnsi="Palatino Linotype"/>
           <w:i w:val="0"/>
           <w:sz w:val="20"/>
         </w:rPr>
@@ -701,7 +766,7 @@
       </w:pPr>
       <w:r>
         <w:rPr>
-          <w:rFonts w:ascii="Times New Roman" w:hAnsi="Times New Roman"/>
+          <w:rFonts w:ascii="Palatino Linotype" w:hAnsi="Palatino Linotype"/>
           <w:i/>
           <w:sz w:val="18"/>
         </w:rPr>
@@ -715,7 +780,7 @@
       </w:pPr>
       <w:r>
         <w:rPr>
-          <w:rFonts w:ascii="Times New Roman" w:hAnsi="Times New Roman"/>
+          <w:rFonts w:ascii="Palatino Linotype" w:hAnsi="Palatino Linotype"/>
           <w:i w:val="0"/>
           <w:sz w:val="20"/>
         </w:rPr>
@@ -728,7 +793,7 @@
       </w:pPr>
       <w:r>
         <w:rPr>
-          <w:rFonts w:ascii="Times New Roman" w:hAnsi="Times New Roman"/>
+          <w:rFonts w:ascii="Palatino Linotype" w:hAnsi="Palatino Linotype"/>
           <w:b/>
           <w:sz w:val="22"/>
         </w:rPr>
@@ -742,7 +807,7 @@
       </w:pPr>
       <w:r>
         <w:rPr>
-          <w:rFonts w:ascii="Times New Roman" w:hAnsi="Times New Roman"/>
+          <w:rFonts w:ascii="Palatino Linotype" w:hAnsi="Palatino Linotype"/>
           <w:i w:val="0"/>
           <w:sz w:val="20"/>
         </w:rPr>
@@ -755,7 +820,7 @@
       </w:pPr>
       <w:r>
         <w:rPr>
-          <w:rFonts w:ascii="Times New Roman" w:hAnsi="Times New Roman"/>
+          <w:rFonts w:ascii="Palatino Linotype" w:hAnsi="Palatino Linotype"/>
           <w:b/>
           <w:sz w:val="24"/>
         </w:rPr>
@@ -769,7 +834,7 @@
       </w:pPr>
       <w:r>
         <w:rPr>
-          <w:rFonts w:ascii="Times New Roman" w:hAnsi="Times New Roman"/>
+          <w:rFonts w:ascii="Palatino Linotype" w:hAnsi="Palatino Linotype"/>
           <w:i w:val="0"/>
           <w:sz w:val="20"/>
         </w:rPr>
@@ -782,7 +847,7 @@
       </w:pPr>
       <w:r>
         <w:rPr>
-          <w:rFonts w:ascii="Times New Roman" w:hAnsi="Times New Roman"/>
+          <w:rFonts w:ascii="Palatino Linotype" w:hAnsi="Palatino Linotype"/>
           <w:b/>
           <w:sz w:val="22"/>
         </w:rPr>
@@ -796,7 +861,7 @@
       </w:pPr>
       <w:r>
         <w:rPr>
-          <w:rFonts w:ascii="Times New Roman" w:hAnsi="Times New Roman"/>
+          <w:rFonts w:ascii="Palatino Linotype" w:hAnsi="Palatino Linotype"/>
           <w:i w:val="0"/>
           <w:sz w:val="20"/>
         </w:rPr>
@@ -809,7 +874,7 @@
       </w:pPr>
       <w:r>
         <w:rPr>
-          <w:rFonts w:ascii="Times New Roman" w:hAnsi="Times New Roman"/>
+          <w:rFonts w:ascii="Palatino Linotype" w:hAnsi="Palatino Linotype"/>
           <w:b/>
           <w:sz w:val="22"/>
         </w:rPr>
@@ -961,7 +1026,7 @@
     </w:p>
     <w:sectPr>
       <w:pgSz w:w="11906" w:h="16838"/>
-      <w:pgMar w:top="1134" w:right="1134" w:bottom="1134" w:left="1134" w:header="720" w:footer="720" w:gutter="0"/>
+      <w:pgMar w:top="1009" w:right="1009" w:bottom="1009" w:left="1009" w:header="720" w:footer="720" w:gutter="0"/>
       <w:cols w:space="720"/>
       <w:docGrid w:linePitch="360"/>
     </w:sectPr>
@@ -1336,7 +1401,7 @@
       <w:spacing w:after="40"/>
     </w:pPr>
     <w:rPr>
-      <w:rFonts w:ascii="Times New Roman" w:hAnsi="Times New Roman"/>
+      <w:rFonts w:ascii="Palatino Linotype" w:hAnsi="Palatino Linotype"/>
       <w:sz w:val="20"/>
     </w:rPr>
   </w:style>

</xml_diff>